<commit_message>
Informe final y correcciones
</commit_message>
<xml_diff>
--- a/Informe_Tecnico_EFT_S9.docx
+++ b/Informe_Tecnico_EFT_S9.docx
@@ -3954,6 +3954,9 @@
       </w:r>
     </w:p>
     <w:p>
+      <w:pPr>
+        <w:keepNext/>
+      </w:pPr>
       <w:r>
         <w:rPr>
           <w:b/>
@@ -3963,47 +3966,54 @@
         <w:t>Figura 5. docker compose ps con todos los servicios healthy.</w:t>
       </w:r>
     </w:p>
-    <w:tbl>
-      <w:tblPr>
-        <w:tblStyle w:val="TableGrid"/>
-        <w:tblW w:type="auto" w:w="0"/>
-        <w:tblLook w:firstColumn="1" w:firstRow="1" w:lastColumn="0" w:lastRow="0" w:noHBand="0" w:noVBand="1" w:val="04A0"/>
-      </w:tblPr>
-      <w:tblGrid>
-        <w:gridCol w:w="9632"/>
-      </w:tblGrid>
-      <w:tr>
-        <w:tc>
-          <w:tcPr>
-            <w:tcW w:type="dxa" w:w="9632"/>
-            <w:shd w:val="clear" w:color="auto" w:fill="F2F2F2"/>
-          </w:tcPr>
-          <w:p>
-            <w:pPr>
-              <w:jc w:val="center"/>
-            </w:pPr>
-            <w:r/>
-            <w:r>
-              <w:rPr>
-                <w:i/>
-                <w:color w:val="888888"/>
-              </w:rPr>
-              <w:t>[ Pegar aquí la captura: docker compose ps con todos los servicios healthy ]</w:t>
-            </w:r>
-          </w:p>
-          <w:p/>
-          <w:p/>
-          <w:p/>
-          <w:p/>
-        </w:tc>
-      </w:tr>
-    </w:tbl>
+    <w:p>
+      <w:pPr>
+        <w:jc w:val="center"/>
+      </w:pPr>
+      <w:r>
+        <w:drawing>
+          <wp:inline xmlns:a="http://schemas.openxmlformats.org/drawingml/2006/main" xmlns:pic="http://schemas.openxmlformats.org/drawingml/2006/picture">
+            <wp:extent cx="5580000" cy="1535456"/>
+            <wp:docPr id="5" name="Picture 5"/>
+            <wp:cNvGraphicFramePr>
+              <a:graphicFrameLocks noChangeAspect="1"/>
+            </wp:cNvGraphicFramePr>
+            <a:graphic>
+              <a:graphicData uri="http://schemas.openxmlformats.org/drawingml/2006/picture">
+                <pic:pic>
+                  <pic:nvPicPr>
+                    <pic:cNvPr id="0" name="583759753.png"/>
+                    <pic:cNvPicPr/>
+                  </pic:nvPicPr>
+                  <pic:blipFill>
+                    <a:blip r:embed="rId14"/>
+                    <a:stretch>
+                      <a:fillRect/>
+                    </a:stretch>
+                  </pic:blipFill>
+                  <pic:spPr>
+                    <a:xfrm>
+                      <a:off x="0" y="0"/>
+                      <a:ext cx="5580000" cy="1535456"/>
+                    </a:xfrm>
+                    <a:prstGeom prst="rect"/>
+                  </pic:spPr>
+                </pic:pic>
+              </a:graphicData>
+            </a:graphic>
+          </wp:inline>
+        </w:drawing>
+      </w:r>
+    </w:p>
     <w:p>
       <w:pPr>
         <w:spacing w:after="40"/>
       </w:pPr>
     </w:p>
     <w:p>
+      <w:pPr>
+        <w:keepNext/>
+      </w:pPr>
       <w:r>
         <w:rPr>
           <w:b/>
@@ -4013,47 +4023,54 @@
         <w:t>Figura 6. Panel de Eureka con los servicios registrados.</w:t>
       </w:r>
     </w:p>
-    <w:tbl>
-      <w:tblPr>
-        <w:tblStyle w:val="TableGrid"/>
-        <w:tblW w:type="auto" w:w="0"/>
-        <w:tblLook w:firstColumn="1" w:firstRow="1" w:lastColumn="0" w:lastRow="0" w:noHBand="0" w:noVBand="1" w:val="04A0"/>
-      </w:tblPr>
-      <w:tblGrid>
-        <w:gridCol w:w="9632"/>
-      </w:tblGrid>
-      <w:tr>
-        <w:tc>
-          <w:tcPr>
-            <w:tcW w:type="dxa" w:w="9632"/>
-            <w:shd w:val="clear" w:color="auto" w:fill="F2F2F2"/>
-          </w:tcPr>
-          <w:p>
-            <w:pPr>
-              <w:jc w:val="center"/>
-            </w:pPr>
-            <w:r/>
-            <w:r>
-              <w:rPr>
-                <w:i/>
-                <w:color w:val="888888"/>
-              </w:rPr>
-              <w:t>[ Pegar aquí la captura: Panel de Eureka con los servicios registrados ]</w:t>
-            </w:r>
-          </w:p>
-          <w:p/>
-          <w:p/>
-          <w:p/>
-          <w:p/>
-        </w:tc>
-      </w:tr>
-    </w:tbl>
+    <w:p>
+      <w:pPr>
+        <w:jc w:val="center"/>
+      </w:pPr>
+      <w:r>
+        <w:drawing>
+          <wp:inline xmlns:a="http://schemas.openxmlformats.org/drawingml/2006/main" xmlns:pic="http://schemas.openxmlformats.org/drawingml/2006/picture">
+            <wp:extent cx="5580000" cy="2591548"/>
+            <wp:docPr id="6" name="Picture 6"/>
+            <wp:cNvGraphicFramePr>
+              <a:graphicFrameLocks noChangeAspect="1"/>
+            </wp:cNvGraphicFramePr>
+            <a:graphic>
+              <a:graphicData uri="http://schemas.openxmlformats.org/drawingml/2006/picture">
+                <pic:pic>
+                  <pic:nvPicPr>
+                    <pic:cNvPr id="0" name="583757507.png"/>
+                    <pic:cNvPicPr/>
+                  </pic:nvPicPr>
+                  <pic:blipFill>
+                    <a:blip r:embed="rId15"/>
+                    <a:stretch>
+                      <a:fillRect/>
+                    </a:stretch>
+                  </pic:blipFill>
+                  <pic:spPr>
+                    <a:xfrm>
+                      <a:off x="0" y="0"/>
+                      <a:ext cx="5580000" cy="2591548"/>
+                    </a:xfrm>
+                    <a:prstGeom prst="rect"/>
+                  </pic:spPr>
+                </pic:pic>
+              </a:graphicData>
+            </a:graphic>
+          </wp:inline>
+        </w:drawing>
+      </w:r>
+    </w:p>
     <w:p>
       <w:pPr>
         <w:spacing w:after="40"/>
       </w:pPr>
     </w:p>
     <w:p>
+      <w:pPr>
+        <w:keepNext/>
+      </w:pPr>
       <w:r>
         <w:rPr>
           <w:b/>
@@ -4063,47 +4080,54 @@
         <w:t>Figura 7. Config Server entregando la configuración de batch-service.</w:t>
       </w:r>
     </w:p>
-    <w:tbl>
-      <w:tblPr>
-        <w:tblStyle w:val="TableGrid"/>
-        <w:tblW w:type="auto" w:w="0"/>
-        <w:tblLook w:firstColumn="1" w:firstRow="1" w:lastColumn="0" w:lastRow="0" w:noHBand="0" w:noVBand="1" w:val="04A0"/>
-      </w:tblPr>
-      <w:tblGrid>
-        <w:gridCol w:w="9632"/>
-      </w:tblGrid>
-      <w:tr>
-        <w:tc>
-          <w:tcPr>
-            <w:tcW w:type="dxa" w:w="9632"/>
-            <w:shd w:val="clear" w:color="auto" w:fill="F2F2F2"/>
-          </w:tcPr>
-          <w:p>
-            <w:pPr>
-              <w:jc w:val="center"/>
-            </w:pPr>
-            <w:r/>
-            <w:r>
-              <w:rPr>
-                <w:i/>
-                <w:color w:val="888888"/>
-              </w:rPr>
-              <w:t>[ Pegar aquí la captura: Config Server entregando la configuración de batch-service ]</w:t>
-            </w:r>
-          </w:p>
-          <w:p/>
-          <w:p/>
-          <w:p/>
-          <w:p/>
-        </w:tc>
-      </w:tr>
-    </w:tbl>
+    <w:p>
+      <w:pPr>
+        <w:jc w:val="center"/>
+      </w:pPr>
+      <w:r>
+        <w:drawing>
+          <wp:inline xmlns:a="http://schemas.openxmlformats.org/drawingml/2006/main" xmlns:pic="http://schemas.openxmlformats.org/drawingml/2006/picture">
+            <wp:extent cx="5580000" cy="988002"/>
+            <wp:docPr id="7" name="Picture 7"/>
+            <wp:cNvGraphicFramePr>
+              <a:graphicFrameLocks noChangeAspect="1"/>
+            </wp:cNvGraphicFramePr>
+            <a:graphic>
+              <a:graphicData uri="http://schemas.openxmlformats.org/drawingml/2006/picture">
+                <pic:pic>
+                  <pic:nvPicPr>
+                    <pic:cNvPr id="0" name="582078990.png"/>
+                    <pic:cNvPicPr/>
+                  </pic:nvPicPr>
+                  <pic:blipFill>
+                    <a:blip r:embed="rId16"/>
+                    <a:stretch>
+                      <a:fillRect/>
+                    </a:stretch>
+                  </pic:blipFill>
+                  <pic:spPr>
+                    <a:xfrm>
+                      <a:off x="0" y="0"/>
+                      <a:ext cx="5580000" cy="988002"/>
+                    </a:xfrm>
+                    <a:prstGeom prst="rect"/>
+                  </pic:spPr>
+                </pic:pic>
+              </a:graphicData>
+            </a:graphic>
+          </wp:inline>
+        </w:drawing>
+      </w:r>
+    </w:p>
     <w:p>
       <w:pPr>
         <w:spacing w:after="40"/>
       </w:pPr>
     </w:p>
     <w:p>
+      <w:pPr>
+        <w:keepNext/>
+      </w:pPr>
       <w:r>
         <w:rPr>
           <w:b/>
@@ -4113,47 +4137,124 @@
         <w:t>Figura 8. Postman: 3 jobs COMPLETED (leídos / escritos / omitidos).</w:t>
       </w:r>
     </w:p>
-    <w:tbl>
-      <w:tblPr>
-        <w:tblStyle w:val="TableGrid"/>
-        <w:tblW w:type="auto" w:w="0"/>
-        <w:tblLook w:firstColumn="1" w:firstRow="1" w:lastColumn="0" w:lastRow="0" w:noHBand="0" w:noVBand="1" w:val="04A0"/>
-      </w:tblPr>
-      <w:tblGrid>
-        <w:gridCol w:w="9632"/>
-      </w:tblGrid>
-      <w:tr>
-        <w:tc>
-          <w:tcPr>
-            <w:tcW w:type="dxa" w:w="9632"/>
-            <w:shd w:val="clear" w:color="auto" w:fill="F2F2F2"/>
-          </w:tcPr>
-          <w:p>
-            <w:pPr>
-              <w:jc w:val="center"/>
-            </w:pPr>
-            <w:r/>
-            <w:r>
-              <w:rPr>
-                <w:i/>
-                <w:color w:val="888888"/>
-              </w:rPr>
-              <w:t>[ Pegar aquí la captura: Postman: 3 jobs COMPLETED (leídos / escritos / omitidos) ]</w:t>
-            </w:r>
-          </w:p>
-          <w:p/>
-          <w:p/>
-          <w:p/>
-          <w:p/>
-        </w:tc>
-      </w:tr>
-    </w:tbl>
+    <w:p>
+      <w:pPr>
+        <w:jc w:val="center"/>
+      </w:pPr>
+      <w:r>
+        <w:drawing>
+          <wp:inline xmlns:a="http://schemas.openxmlformats.org/drawingml/2006/main" xmlns:pic="http://schemas.openxmlformats.org/drawingml/2006/picture">
+            <wp:extent cx="4722829" cy="3060000"/>
+            <wp:docPr id="8" name="Picture 8"/>
+            <wp:cNvGraphicFramePr>
+              <a:graphicFrameLocks noChangeAspect="1"/>
+            </wp:cNvGraphicFramePr>
+            <a:graphic>
+              <a:graphicData uri="http://schemas.openxmlformats.org/drawingml/2006/picture">
+                <pic:pic>
+                  <pic:nvPicPr>
+                    <pic:cNvPr id="0" name="593566649.png"/>
+                    <pic:cNvPicPr/>
+                  </pic:nvPicPr>
+                  <pic:blipFill>
+                    <a:blip r:embed="rId17"/>
+                    <a:stretch>
+                      <a:fillRect/>
+                    </a:stretch>
+                  </pic:blipFill>
+                  <pic:spPr>
+                    <a:xfrm>
+                      <a:off x="0" y="0"/>
+                      <a:ext cx="4722829" cy="3060000"/>
+                    </a:xfrm>
+                    <a:prstGeom prst="rect"/>
+                  </pic:spPr>
+                </pic:pic>
+              </a:graphicData>
+            </a:graphic>
+          </wp:inline>
+        </w:drawing>
+        <w:br/>
+      </w:r>
+      <w:r>
+        <w:drawing>
+          <wp:inline xmlns:a="http://schemas.openxmlformats.org/drawingml/2006/main" xmlns:pic="http://schemas.openxmlformats.org/drawingml/2006/picture">
+            <wp:extent cx="4441636" cy="3060000"/>
+            <wp:docPr id="9" name="Picture 9"/>
+            <wp:cNvGraphicFramePr>
+              <a:graphicFrameLocks noChangeAspect="1"/>
+            </wp:cNvGraphicFramePr>
+            <a:graphic>
+              <a:graphicData uri="http://schemas.openxmlformats.org/drawingml/2006/picture">
+                <pic:pic>
+                  <pic:nvPicPr>
+                    <pic:cNvPr id="0" name="593618932.png"/>
+                    <pic:cNvPicPr/>
+                  </pic:nvPicPr>
+                  <pic:blipFill>
+                    <a:blip r:embed="rId18"/>
+                    <a:stretch>
+                      <a:fillRect/>
+                    </a:stretch>
+                  </pic:blipFill>
+                  <pic:spPr>
+                    <a:xfrm>
+                      <a:off x="0" y="0"/>
+                      <a:ext cx="4441636" cy="3060000"/>
+                    </a:xfrm>
+                    <a:prstGeom prst="rect"/>
+                  </pic:spPr>
+                </pic:pic>
+              </a:graphicData>
+            </a:graphic>
+          </wp:inline>
+        </w:drawing>
+        <w:br/>
+      </w:r>
+      <w:r>
+        <w:drawing>
+          <wp:inline xmlns:a="http://schemas.openxmlformats.org/drawingml/2006/main" xmlns:pic="http://schemas.openxmlformats.org/drawingml/2006/picture">
+            <wp:extent cx="4401998" cy="3060000"/>
+            <wp:docPr id="10" name="Picture 10"/>
+            <wp:cNvGraphicFramePr>
+              <a:graphicFrameLocks noChangeAspect="1"/>
+            </wp:cNvGraphicFramePr>
+            <a:graphic>
+              <a:graphicData uri="http://schemas.openxmlformats.org/drawingml/2006/picture">
+                <pic:pic>
+                  <pic:nvPicPr>
+                    <pic:cNvPr id="0" name="593809272.png"/>
+                    <pic:cNvPicPr/>
+                  </pic:nvPicPr>
+                  <pic:blipFill>
+                    <a:blip r:embed="rId19"/>
+                    <a:stretch>
+                      <a:fillRect/>
+                    </a:stretch>
+                  </pic:blipFill>
+                  <pic:spPr>
+                    <a:xfrm>
+                      <a:off x="0" y="0"/>
+                      <a:ext cx="4401998" cy="3060000"/>
+                    </a:xfrm>
+                    <a:prstGeom prst="rect"/>
+                  </pic:spPr>
+                </pic:pic>
+              </a:graphicData>
+            </a:graphic>
+          </wp:inline>
+        </w:drawing>
+      </w:r>
+    </w:p>
     <w:p>
       <w:pPr>
         <w:spacing w:after="40"/>
       </w:pPr>
     </w:p>
     <w:p>
+      <w:pPr>
+        <w:keepNext/>
+      </w:pPr>
       <w:r>
         <w:rPr>
           <w:b/>
@@ -4163,47 +4264,54 @@
         <w:t>Figura 9. Reporte de intereses y registros rechazados con su motivo.</w:t>
       </w:r>
     </w:p>
-    <w:tbl>
-      <w:tblPr>
-        <w:tblStyle w:val="TableGrid"/>
-        <w:tblW w:type="auto" w:w="0"/>
-        <w:tblLook w:firstColumn="1" w:firstRow="1" w:lastColumn="0" w:lastRow="0" w:noHBand="0" w:noVBand="1" w:val="04A0"/>
-      </w:tblPr>
-      <w:tblGrid>
-        <w:gridCol w:w="9632"/>
-      </w:tblGrid>
-      <w:tr>
-        <w:tc>
-          <w:tcPr>
-            <w:tcW w:type="dxa" w:w="9632"/>
-            <w:shd w:val="clear" w:color="auto" w:fill="F2F2F2"/>
-          </w:tcPr>
-          <w:p>
-            <w:pPr>
-              <w:jc w:val="center"/>
-            </w:pPr>
-            <w:r/>
-            <w:r>
-              <w:rPr>
-                <w:i/>
-                <w:color w:val="888888"/>
-              </w:rPr>
-              <w:t>[ Pegar aquí la captura: Reporte de intereses y registros rechazados con su motivo ]</w:t>
-            </w:r>
-          </w:p>
-          <w:p/>
-          <w:p/>
-          <w:p/>
-          <w:p/>
-        </w:tc>
-      </w:tr>
-    </w:tbl>
+    <w:p>
+      <w:pPr>
+        <w:jc w:val="center"/>
+      </w:pPr>
+      <w:r>
+        <w:drawing>
+          <wp:inline xmlns:a="http://schemas.openxmlformats.org/drawingml/2006/main" xmlns:pic="http://schemas.openxmlformats.org/drawingml/2006/picture">
+            <wp:extent cx="4974862" cy="3420000"/>
+            <wp:docPr id="11" name="Picture 11"/>
+            <wp:cNvGraphicFramePr>
+              <a:graphicFrameLocks noChangeAspect="1"/>
+            </wp:cNvGraphicFramePr>
+            <a:graphic>
+              <a:graphicData uri="http://schemas.openxmlformats.org/drawingml/2006/picture">
+                <pic:pic>
+                  <pic:nvPicPr>
+                    <pic:cNvPr id="0" name="593643395.png"/>
+                    <pic:cNvPicPr/>
+                  </pic:nvPicPr>
+                  <pic:blipFill>
+                    <a:blip r:embed="rId20"/>
+                    <a:stretch>
+                      <a:fillRect/>
+                    </a:stretch>
+                  </pic:blipFill>
+                  <pic:spPr>
+                    <a:xfrm>
+                      <a:off x="0" y="0"/>
+                      <a:ext cx="4974862" cy="3420000"/>
+                    </a:xfrm>
+                    <a:prstGeom prst="rect"/>
+                  </pic:spPr>
+                </pic:pic>
+              </a:graphicData>
+            </a:graphic>
+          </wp:inline>
+        </w:drawing>
+      </w:r>
+    </w:p>
     <w:p>
       <w:pPr>
         <w:spacing w:after="40"/>
       </w:pPr>
     </w:p>
     <w:p>
+      <w:pPr>
+        <w:keepNext/>
+      </w:pPr>
       <w:r>
         <w:rPr>
           <w:b/>
@@ -4213,45 +4321,101 @@
         <w:t>Figura 10. Archivos CSV generados en /app/output.</w:t>
       </w:r>
     </w:p>
-    <w:tbl>
-      <w:tblPr>
-        <w:tblStyle w:val="TableGrid"/>
-        <w:tblW w:type="auto" w:w="0"/>
-        <w:tblLook w:firstColumn="1" w:firstRow="1" w:lastColumn="0" w:lastRow="0" w:noHBand="0" w:noVBand="1" w:val="04A0"/>
-      </w:tblPr>
-      <w:tblGrid>
-        <w:gridCol w:w="9632"/>
-      </w:tblGrid>
-      <w:tr>
-        <w:tc>
-          <w:tcPr>
-            <w:tcW w:type="dxa" w:w="9632"/>
-            <w:shd w:val="clear" w:color="auto" w:fill="F2F2F2"/>
-          </w:tcPr>
-          <w:p>
-            <w:pPr>
-              <w:jc w:val="center"/>
-            </w:pPr>
-            <w:r/>
-            <w:r>
-              <w:rPr>
-                <w:i/>
-                <w:color w:val="888888"/>
-              </w:rPr>
-              <w:t>[ Pegar aquí la captura: Archivos CSV generados en /app/output ]</w:t>
-            </w:r>
-          </w:p>
-          <w:p/>
-          <w:p/>
-          <w:p/>
-          <w:p/>
-        </w:tc>
-      </w:tr>
-    </w:tbl>
+    <w:p>
+      <w:pPr>
+        <w:jc w:val="center"/>
+      </w:pPr>
+      <w:r>
+        <w:drawing>
+          <wp:inline xmlns:a="http://schemas.openxmlformats.org/drawingml/2006/main" xmlns:pic="http://schemas.openxmlformats.org/drawingml/2006/picture">
+            <wp:extent cx="5580000" cy="711823"/>
+            <wp:docPr id="12" name="Picture 12"/>
+            <wp:cNvGraphicFramePr>
+              <a:graphicFrameLocks noChangeAspect="1"/>
+            </wp:cNvGraphicFramePr>
+            <a:graphic>
+              <a:graphicData uri="http://schemas.openxmlformats.org/drawingml/2006/picture">
+                <pic:pic>
+                  <pic:nvPicPr>
+                    <pic:cNvPr id="0" name="594853549.png"/>
+                    <pic:cNvPicPr/>
+                  </pic:nvPicPr>
+                  <pic:blipFill>
+                    <a:blip r:embed="rId21"/>
+                    <a:stretch>
+                      <a:fillRect/>
+                    </a:stretch>
+                  </pic:blipFill>
+                  <pic:spPr>
+                    <a:xfrm>
+                      <a:off x="0" y="0"/>
+                      <a:ext cx="5580000" cy="711823"/>
+                    </a:xfrm>
+                    <a:prstGeom prst="rect"/>
+                  </pic:spPr>
+                </pic:pic>
+              </a:graphicData>
+            </a:graphic>
+          </wp:inline>
+        </w:drawing>
+      </w:r>
+    </w:p>
     <w:p>
       <w:pPr>
         <w:spacing w:after="40"/>
       </w:pPr>
+    </w:p>
+    <w:p>
+      <w:pPr>
+        <w:keepNext/>
+      </w:pPr>
+      <w:r>
+        <w:rPr>
+          <w:b/>
+          <w:i w:val="0"/>
+          <w:sz w:val="20"/>
+        </w:rPr>
+        <w:t>Figura 11. Postman Runner: ejecución completa de la colección (87 tests; incluye depósito, transferencia y compensación 404).</w:t>
+      </w:r>
+    </w:p>
+    <w:p>
+      <w:pPr>
+        <w:jc w:val="center"/>
+      </w:pPr>
+      <w:r>
+        <w:drawing>
+          <wp:inline xmlns:a="http://schemas.openxmlformats.org/drawingml/2006/main" xmlns:pic="http://schemas.openxmlformats.org/drawingml/2006/picture">
+            <wp:extent cx="5015071" cy="3420000"/>
+            <wp:docPr id="13" name="Picture 13"/>
+            <wp:cNvGraphicFramePr>
+              <a:graphicFrameLocks noChangeAspect="1"/>
+            </wp:cNvGraphicFramePr>
+            <a:graphic>
+              <a:graphicData uri="http://schemas.openxmlformats.org/drawingml/2006/picture">
+                <pic:pic>
+                  <pic:nvPicPr>
+                    <pic:cNvPr id="0" name="594721693.png"/>
+                    <pic:cNvPicPr/>
+                  </pic:nvPicPr>
+                  <pic:blipFill>
+                    <a:blip r:embed="rId22"/>
+                    <a:stretch>
+                      <a:fillRect/>
+                    </a:stretch>
+                  </pic:blipFill>
+                  <pic:spPr>
+                    <a:xfrm>
+                      <a:off x="0" y="0"/>
+                      <a:ext cx="5015071" cy="3420000"/>
+                    </a:xfrm>
+                    <a:prstGeom prst="rect"/>
+                  </pic:spPr>
+                </pic:pic>
+              </a:graphicData>
+            </a:graphic>
+          </wp:inline>
+        </w:drawing>
+      </w:r>
     </w:p>
     <w:p>
       <w:r>
@@ -4260,50 +4424,18 @@
           <w:i w:val="0"/>
           <w:sz w:val="20"/>
         </w:rPr>
-        <w:t>Figura 11. Postman: depósito, transferencia y transferencia con compensación (404).</w:t>
+        <w:t>Nota: de los 87 tests, 86 pasaron. El único fallido correspondía a un request de prueba "Sin token" de la carpeta 07 que estaba configurado para enviar token (error de la colección, no del sistema); fue corregido en la colección entregada.</w:t>
       </w:r>
     </w:p>
-    <w:tbl>
-      <w:tblPr>
-        <w:tblStyle w:val="TableGrid"/>
-        <w:tblW w:type="auto" w:w="0"/>
-        <w:tblLook w:firstColumn="1" w:firstRow="1" w:lastColumn="0" w:lastRow="0" w:noHBand="0" w:noVBand="1" w:val="04A0"/>
-      </w:tblPr>
-      <w:tblGrid>
-        <w:gridCol w:w="9632"/>
-      </w:tblGrid>
-      <w:tr>
-        <w:tc>
-          <w:tcPr>
-            <w:tcW w:type="dxa" w:w="9632"/>
-            <w:shd w:val="clear" w:color="auto" w:fill="F2F2F2"/>
-          </w:tcPr>
-          <w:p>
-            <w:pPr>
-              <w:jc w:val="center"/>
-            </w:pPr>
-            <w:r/>
-            <w:r>
-              <w:rPr>
-                <w:i/>
-                <w:color w:val="888888"/>
-              </w:rPr>
-              <w:t>[ Pegar aquí la captura: Postman: depósito, transferencia y transferencia con compensación (404) ]</w:t>
-            </w:r>
-          </w:p>
-          <w:p/>
-          <w:p/>
-          <w:p/>
-          <w:p/>
-        </w:tc>
-      </w:tr>
-    </w:tbl>
     <w:p>
       <w:pPr>
         <w:spacing w:after="40"/>
       </w:pPr>
     </w:p>
     <w:p>
+      <w:pPr>
+        <w:keepNext/>
+      </w:pPr>
       <w:r>
         <w:rPr>
           <w:b/>
@@ -4313,97 +4445,146 @@
         <w:t>Figura 12. Kafka UI: eventos en banking.transacciones y notificaciones.</w:t>
       </w:r>
     </w:p>
-    <w:tbl>
-      <w:tblPr>
-        <w:tblStyle w:val="TableGrid"/>
-        <w:tblW w:type="auto" w:w="0"/>
-        <w:tblLook w:firstColumn="1" w:firstRow="1" w:lastColumn="0" w:lastRow="0" w:noHBand="0" w:noVBand="1" w:val="04A0"/>
-      </w:tblPr>
-      <w:tblGrid>
-        <w:gridCol w:w="9632"/>
-      </w:tblGrid>
-      <w:tr>
-        <w:tc>
-          <w:tcPr>
-            <w:tcW w:type="dxa" w:w="9632"/>
-            <w:shd w:val="clear" w:color="auto" w:fill="F2F2F2"/>
-          </w:tcPr>
-          <w:p>
-            <w:pPr>
-              <w:jc w:val="center"/>
-            </w:pPr>
-            <w:r/>
-            <w:r>
-              <w:rPr>
-                <w:i/>
-                <w:color w:val="888888"/>
-              </w:rPr>
-              <w:t>[ Pegar aquí la captura: Kafka UI: eventos en banking.transacciones y notificaciones ]</w:t>
-            </w:r>
-          </w:p>
-          <w:p/>
-          <w:p/>
-          <w:p/>
-          <w:p/>
-        </w:tc>
-      </w:tr>
-    </w:tbl>
+    <w:p>
+      <w:pPr>
+        <w:jc w:val="center"/>
+      </w:pPr>
+      <w:r>
+        <w:drawing>
+          <wp:inline xmlns:a="http://schemas.openxmlformats.org/drawingml/2006/main" xmlns:pic="http://schemas.openxmlformats.org/drawingml/2006/picture">
+            <wp:extent cx="5580000" cy="2420906"/>
+            <wp:docPr id="14" name="Picture 14"/>
+            <wp:cNvGraphicFramePr>
+              <a:graphicFrameLocks noChangeAspect="1"/>
+            </wp:cNvGraphicFramePr>
+            <a:graphic>
+              <a:graphicData uri="http://schemas.openxmlformats.org/drawingml/2006/picture">
+                <pic:pic>
+                  <pic:nvPicPr>
+                    <pic:cNvPr id="0" name="594577182.png"/>
+                    <pic:cNvPicPr/>
+                  </pic:nvPicPr>
+                  <pic:blipFill>
+                    <a:blip r:embed="rId23"/>
+                    <a:stretch>
+                      <a:fillRect/>
+                    </a:stretch>
+                  </pic:blipFill>
+                  <pic:spPr>
+                    <a:xfrm>
+                      <a:off x="0" y="0"/>
+                      <a:ext cx="5580000" cy="2420906"/>
+                    </a:xfrm>
+                    <a:prstGeom prst="rect"/>
+                  </pic:spPr>
+                </pic:pic>
+              </a:graphicData>
+            </a:graphic>
+          </wp:inline>
+        </w:drawing>
+      </w:r>
+    </w:p>
     <w:p>
       <w:pPr>
         <w:spacing w:after="40"/>
       </w:pPr>
     </w:p>
     <w:p>
+      <w:pPr>
+        <w:keepNext/>
+      </w:pPr>
       <w:r>
         <w:rPr>
           <w:b/>
           <w:i w:val="0"/>
           <w:sz w:val="20"/>
         </w:rPr>
-        <w:t>Figura 13. Circuit Breaker abierto (503) y recuperación (CLOSED).</w:t>
+        <w:t>Figura 13. Circuit Breaker abierto (503, con cuentas-service detenido) y recuperación (breaker CLOSED al volver el servicio).</w:t>
       </w:r>
     </w:p>
-    <w:tbl>
-      <w:tblPr>
-        <w:tblStyle w:val="TableGrid"/>
-        <w:tblW w:type="auto" w:w="0"/>
-        <w:tblLook w:firstColumn="1" w:firstRow="1" w:lastColumn="0" w:lastRow="0" w:noHBand="0" w:noVBand="1" w:val="04A0"/>
-      </w:tblPr>
-      <w:tblGrid>
-        <w:gridCol w:w="9632"/>
-      </w:tblGrid>
-      <w:tr>
-        <w:tc>
-          <w:tcPr>
-            <w:tcW w:type="dxa" w:w="9632"/>
-            <w:shd w:val="clear" w:color="auto" w:fill="F2F2F2"/>
-          </w:tcPr>
-          <w:p>
-            <w:pPr>
-              <w:jc w:val="center"/>
-            </w:pPr>
-            <w:r/>
-            <w:r>
-              <w:rPr>
-                <w:i/>
-                <w:color w:val="888888"/>
-              </w:rPr>
-              <w:t>[ Pegar aquí la captura: Circuit Breaker abierto (503) y recuperación (CLOSED) ]</w:t>
-            </w:r>
-          </w:p>
-          <w:p/>
-          <w:p/>
-          <w:p/>
-          <w:p/>
-        </w:tc>
-      </w:tr>
-    </w:tbl>
+    <w:p>
+      <w:pPr>
+        <w:jc w:val="center"/>
+      </w:pPr>
+      <w:r>
+        <w:drawing>
+          <wp:inline xmlns:a="http://schemas.openxmlformats.org/drawingml/2006/main" xmlns:pic="http://schemas.openxmlformats.org/drawingml/2006/picture">
+            <wp:extent cx="5289795" cy="3059999"/>
+            <wp:docPr id="15" name="Picture 15"/>
+            <wp:cNvGraphicFramePr>
+              <a:graphicFrameLocks noChangeAspect="1"/>
+            </wp:cNvGraphicFramePr>
+            <a:graphic>
+              <a:graphicData uri="http://schemas.openxmlformats.org/drawingml/2006/picture">
+                <pic:pic>
+                  <pic:nvPicPr>
+                    <pic:cNvPr id="0" name="594917014.png"/>
+                    <pic:cNvPicPr/>
+                  </pic:nvPicPr>
+                  <pic:blipFill>
+                    <a:blip r:embed="rId24"/>
+                    <a:stretch>
+                      <a:fillRect/>
+                    </a:stretch>
+                  </pic:blipFill>
+                  <pic:spPr>
+                    <a:xfrm>
+                      <a:off x="0" y="0"/>
+                      <a:ext cx="5289795" cy="3059999"/>
+                    </a:xfrm>
+                    <a:prstGeom prst="rect"/>
+                  </pic:spPr>
+                </pic:pic>
+              </a:graphicData>
+            </a:graphic>
+          </wp:inline>
+        </w:drawing>
+        <w:br/>
+      </w:r>
+      <w:r>
+        <w:drawing>
+          <wp:inline xmlns:a="http://schemas.openxmlformats.org/drawingml/2006/main" xmlns:pic="http://schemas.openxmlformats.org/drawingml/2006/picture">
+            <wp:extent cx="4450909" cy="3060000"/>
+            <wp:docPr id="16" name="Picture 16"/>
+            <wp:cNvGraphicFramePr>
+              <a:graphicFrameLocks noChangeAspect="1"/>
+            </wp:cNvGraphicFramePr>
+            <a:graphic>
+              <a:graphicData uri="http://schemas.openxmlformats.org/drawingml/2006/picture">
+                <pic:pic>
+                  <pic:nvPicPr>
+                    <pic:cNvPr id="0" name="594979908.png"/>
+                    <pic:cNvPicPr/>
+                  </pic:nvPicPr>
+                  <pic:blipFill>
+                    <a:blip r:embed="rId25"/>
+                    <a:stretch>
+                      <a:fillRect/>
+                    </a:stretch>
+                  </pic:blipFill>
+                  <pic:spPr>
+                    <a:xfrm>
+                      <a:off x="0" y="0"/>
+                      <a:ext cx="4450909" cy="3060000"/>
+                    </a:xfrm>
+                    <a:prstGeom prst="rect"/>
+                  </pic:spPr>
+                </pic:pic>
+              </a:graphicData>
+            </a:graphic>
+          </wp:inline>
+        </w:drawing>
+      </w:r>
+    </w:p>
     <w:p>
       <w:pPr>
         <w:spacing w:after="40"/>
       </w:pPr>
     </w:p>
     <w:p>
+      <w:pPr>
+        <w:keepNext/>
+      </w:pPr>
       <w:r>
         <w:rPr>
           <w:b/>
@@ -4413,41 +4594,45 @@
         <w:t>Figura 14. Escalado: CLIENTES-SERVICE con 2 instancias en Eureka.</w:t>
       </w:r>
     </w:p>
-    <w:tbl>
-      <w:tblPr>
-        <w:tblStyle w:val="TableGrid"/>
-        <w:tblW w:type="auto" w:w="0"/>
-        <w:tblLook w:firstColumn="1" w:firstRow="1" w:lastColumn="0" w:lastRow="0" w:noHBand="0" w:noVBand="1" w:val="04A0"/>
-      </w:tblPr>
-      <w:tblGrid>
-        <w:gridCol w:w="9632"/>
-      </w:tblGrid>
-      <w:tr>
-        <w:tc>
-          <w:tcPr>
-            <w:tcW w:type="dxa" w:w="9632"/>
-            <w:shd w:val="clear" w:color="auto" w:fill="F2F2F2"/>
-          </w:tcPr>
-          <w:p>
-            <w:pPr>
-              <w:jc w:val="center"/>
-            </w:pPr>
-            <w:r/>
-            <w:r>
-              <w:rPr>
-                <w:i/>
-                <w:color w:val="888888"/>
-              </w:rPr>
-              <w:t>[ Pegar aquí la captura: Escalado: CLIENTES-SERVICE con 2 instancias en Eureka ]</w:t>
-            </w:r>
-          </w:p>
-          <w:p/>
-          <w:p/>
-          <w:p/>
-          <w:p/>
-        </w:tc>
-      </w:tr>
-    </w:tbl>
+    <w:p>
+      <w:pPr>
+        <w:jc w:val="center"/>
+      </w:pPr>
+      <w:r>
+        <w:drawing>
+          <wp:inline xmlns:a="http://schemas.openxmlformats.org/drawingml/2006/main" xmlns:pic="http://schemas.openxmlformats.org/drawingml/2006/picture">
+            <wp:extent cx="5580000" cy="2275594"/>
+            <wp:docPr id="17" name="Picture 17"/>
+            <wp:cNvGraphicFramePr>
+              <a:graphicFrameLocks noChangeAspect="1"/>
+            </wp:cNvGraphicFramePr>
+            <a:graphic>
+              <a:graphicData uri="http://schemas.openxmlformats.org/drawingml/2006/picture">
+                <pic:pic>
+                  <pic:nvPicPr>
+                    <pic:cNvPr id="0" name="595150182.png"/>
+                    <pic:cNvPicPr/>
+                  </pic:nvPicPr>
+                  <pic:blipFill>
+                    <a:blip r:embed="rId26"/>
+                    <a:stretch>
+                      <a:fillRect/>
+                    </a:stretch>
+                  </pic:blipFill>
+                  <pic:spPr>
+                    <a:xfrm>
+                      <a:off x="0" y="0"/>
+                      <a:ext cx="5580000" cy="2275594"/>
+                    </a:xfrm>
+                    <a:prstGeom prst="rect"/>
+                  </pic:spPr>
+                </pic:pic>
+              </a:graphicData>
+            </a:graphic>
+          </wp:inline>
+        </w:drawing>
+      </w:r>
+    </w:p>
     <w:p>
       <w:pPr>
         <w:spacing w:after="40"/>

</xml_diff>